<commit_message>
fix(1.3): shorten table-cell underscores to prevent .docx wrap
</commit_message>
<xml_diff>
--- a/frontend/public/resources/1.3-mtss-handbook.docx
+++ b/frontend/public/resources/1.3-mtss-handbook.docx
@@ -755,7 +755,7 @@
               <w:pStyle w:val="Compact"/>
             </w:pPr>
             <w:r>
-              <w:t xml:space="preserve">____________</w:t>
+              <w:t xml:space="preserve">______</w:t>
             </w:r>
           </w:p>
         </w:tc>
@@ -766,7 +766,7 @@
               <w:pStyle w:val="Compact"/>
             </w:pPr>
             <w:r>
-              <w:t xml:space="preserve">____________</w:t>
+              <w:t xml:space="preserve">______</w:t>
             </w:r>
           </w:p>
         </w:tc>
@@ -777,7 +777,7 @@
               <w:pStyle w:val="Compact"/>
             </w:pPr>
             <w:r>
-              <w:t xml:space="preserve">____________</w:t>
+              <w:t xml:space="preserve">______</w:t>
             </w:r>
           </w:p>
         </w:tc>
@@ -801,7 +801,7 @@
               <w:pStyle w:val="Compact"/>
             </w:pPr>
             <w:r>
-              <w:t xml:space="preserve">____________</w:t>
+              <w:t xml:space="preserve">______</w:t>
             </w:r>
           </w:p>
         </w:tc>
@@ -812,7 +812,7 @@
               <w:pStyle w:val="Compact"/>
             </w:pPr>
             <w:r>
-              <w:t xml:space="preserve">____________</w:t>
+              <w:t xml:space="preserve">______</w:t>
             </w:r>
           </w:p>
         </w:tc>
@@ -823,7 +823,7 @@
               <w:pStyle w:val="Compact"/>
             </w:pPr>
             <w:r>
-              <w:t xml:space="preserve">____________</w:t>
+              <w:t xml:space="preserve">______</w:t>
             </w:r>
           </w:p>
         </w:tc>
@@ -847,7 +847,7 @@
               <w:pStyle w:val="Compact"/>
             </w:pPr>
             <w:r>
-              <w:t xml:space="preserve">____________</w:t>
+              <w:t xml:space="preserve">______</w:t>
             </w:r>
           </w:p>
         </w:tc>
@@ -858,7 +858,7 @@
               <w:pStyle w:val="Compact"/>
             </w:pPr>
             <w:r>
-              <w:t xml:space="preserve">____________</w:t>
+              <w:t xml:space="preserve">______</w:t>
             </w:r>
           </w:p>
         </w:tc>
@@ -869,7 +869,7 @@
               <w:pStyle w:val="Compact"/>
             </w:pPr>
             <w:r>
-              <w:t xml:space="preserve">____________</w:t>
+              <w:t xml:space="preserve">______</w:t>
             </w:r>
           </w:p>
         </w:tc>

</xml_diff>